<commit_message>
se agregan los casos de uso, mantenimiento de catalogos, reportes, firma de oficio y modificación del caso
</commit_message>
<xml_diff>
--- a/Casos de Uso/CU_Reglas_de_Negocio_Sistema_Quejas_v1_4.docx
+++ b/Casos de Uso/CU_Reglas_de_Negocio_Sistema_Quejas_v1_4.docx
@@ -425,7 +425,15 @@
           </w:tcPr>
           <w:p>
             <w:r>
-              <w:t>Se reestructura el flujo interno del caso (Auxiliar, Técnico, Supervisor, Jefe de Departamento); se actualizan roles, estados, departamentos y estados de usuario; se agregan las reglas específicas y los mensajes de CU-03, CU-04, CU-07, CU-08, CU-09, CU-10, CU-11, CU-12, CU-13, CU-14, CU-15, CU-16, CU-17 y CU-18; se corrige RN-CU05 y RN-CU06</w:t>
+              <w:t xml:space="preserve">Se reestructura el flujo interno del caso (Auxiliar, Técnico, Supervisor, </w:t>
+            </w:r>
+            <w:proofErr w:type="gramStart"/>
+            <w:r>
+              <w:t>Jefe</w:t>
+            </w:r>
+            <w:proofErr w:type="gramEnd"/>
+            <w:r>
+              <w:t xml:space="preserve"> de Departamento); se actualizan roles, estados, departamentos y estados de usuario; se agregan las reglas específicas y los mensajes de CU-03, CU-04, CU-07, CU-08, CU-09, CU-10, CU-11, CU-12, CU-13, CU-14, CU-15, CU-16, CU-17 y CU-18; se corrige RN-CU05 y RN-CU06</w:t>
             </w:r>
           </w:p>
         </w:tc>
@@ -618,7 +626,15 @@
         <w:spacing w:after="120"/>
       </w:pPr>
       <w:r>
-        <w:t>Este documento cubre los 19 casos de uso del sistema (CU-00 a CU-18), incluyendo el flujo interno reestructurado (Auxiliar, Técnico, Supervisor y Jefe de Departamento) y los dos casos de uso nuevos: CU-17 Firma de Oficio y CU-18 Modificación de Caso.</w:t>
+        <w:t xml:space="preserve">Este documento cubre los 19 casos de uso del sistema (CU-00 a CU-18), incluyendo el flujo interno reestructurado (Auxiliar, Técnico, Supervisor y </w:t>
+      </w:r>
+      <w:proofErr w:type="gramStart"/>
+      <w:r>
+        <w:t>Jefe</w:t>
+      </w:r>
+      <w:proofErr w:type="gramEnd"/>
+      <w:r>
+        <w:t xml:space="preserve"> de Departamento) y los dos casos de uso nuevos: CU-17 Firma de Oficio y CU-18 Modificación de Caso.</w:t>
       </w:r>
     </w:p>
     <w:p>
@@ -1406,7 +1422,15 @@
           </w:tcPr>
           <w:p>
             <w:r>
-              <w:t>Se coloca cuando el Supervisor aprueba el reporte de atención y el caso queda a la espera de la firma del Jefe de Departamento [CU-07] [CU-17].</w:t>
+              <w:t xml:space="preserve">Se coloca cuando el Supervisor aprueba el reporte de atención y el caso queda a la espera de la firma del </w:t>
+            </w:r>
+            <w:proofErr w:type="gramStart"/>
+            <w:r>
+              <w:t>Jefe</w:t>
+            </w:r>
+            <w:proofErr w:type="gramEnd"/>
+            <w:r>
+              <w:t xml:space="preserve"> de Departamento [CU-07] [CU-17].</w:t>
             </w:r>
           </w:p>
         </w:tc>
@@ -1442,7 +1466,15 @@
           </w:tcPr>
           <w:p>
             <w:r>
-              <w:t>Se coloca cuando el Jefe de Departamento firma el oficio de resolución; el sistema notifica al ciudadano [CU-17] [CU-09].</w:t>
+              <w:t xml:space="preserve">Se coloca cuando el </w:t>
+            </w:r>
+            <w:proofErr w:type="gramStart"/>
+            <w:r>
+              <w:t>Jefe</w:t>
+            </w:r>
+            <w:proofErr w:type="gramEnd"/>
+            <w:r>
+              <w:t xml:space="preserve"> de Departamento firma el oficio de resolución; el sistema notifica al ciudadano [CU-17] [CU-09].</w:t>
             </w:r>
           </w:p>
         </w:tc>
@@ -2836,7 +2868,15 @@
           </w:tcPr>
           <w:p>
             <w:r>
-              <w:t xml:space="preserve">Solo pueden ingresar al sistema los usuarios registrados previamente en Mantenimiento de Usuarios [CU-10], con alguno de los siguientes roles: Auxiliar, Técnico, Supervisor, Jefe de Departamento, </w:t>
+              <w:t xml:space="preserve">Solo pueden ingresar al sistema los usuarios registrados previamente en Mantenimiento de Usuarios [CU-10], con alguno de los siguientes roles: Auxiliar, Técnico, Supervisor, </w:t>
+            </w:r>
+            <w:proofErr w:type="gramStart"/>
+            <w:r>
+              <w:t>Jefe</w:t>
+            </w:r>
+            <w:proofErr w:type="gramEnd"/>
+            <w:r>
+              <w:t xml:space="preserve"> de Departamento, </w:t>
             </w:r>
             <w:proofErr w:type="spellStart"/>
             <w:r>
@@ -4611,7 +4651,15 @@
           </w:tcPr>
           <w:p>
             <w:r>
-              <w:t>Cuando el Supervisor aprueba el reporte de atención, el caso pasa a estado Pendiente de Firma y se traslada al Jefe de Departamento [CU-17].</w:t>
+              <w:t xml:space="preserve">Cuando el Supervisor aprueba el reporte de atención, el caso pasa a estado Pendiente de Firma y se traslada al </w:t>
+            </w:r>
+            <w:proofErr w:type="gramStart"/>
+            <w:r>
+              <w:t>Jefe</w:t>
+            </w:r>
+            <w:proofErr w:type="gramEnd"/>
+            <w:r>
+              <w:t xml:space="preserve"> de Departamento [CU-17].</w:t>
             </w:r>
           </w:p>
         </w:tc>
@@ -5588,7 +5636,15 @@
           </w:tcPr>
           <w:p>
             <w:r>
-              <w:t>El Jefe de Departamento únicamente puede visualizar y firmar los casos en estado Pendiente de Firma de su propio departamento.</w:t>
+              <w:t xml:space="preserve">El </w:t>
+            </w:r>
+            <w:proofErr w:type="gramStart"/>
+            <w:r>
+              <w:t>Jefe</w:t>
+            </w:r>
+            <w:proofErr w:type="gramEnd"/>
+            <w:r>
+              <w:t xml:space="preserve"> de Departamento únicamente puede visualizar y firmar los casos en estado Pendiente de Firma de su propio departamento.</w:t>
             </w:r>
           </w:p>
         </w:tc>
@@ -5669,7 +5725,15 @@
           </w:tcPr>
           <w:p>
             <w:r>
-              <w:t>Si el Jefe de Departamento no firma, el caso regresa al Supervisor en estado En Supervisión, junto con las observaciones ingresadas.</w:t>
+              <w:t xml:space="preserve">Si el </w:t>
+            </w:r>
+            <w:proofErr w:type="gramStart"/>
+            <w:r>
+              <w:t>Jefe</w:t>
+            </w:r>
+            <w:proofErr w:type="gramEnd"/>
+            <w:r>
+              <w:t xml:space="preserve"> de Departamento no firma, el caso regresa al Supervisor en estado En Supervisión, junto con las observaciones ingresadas.</w:t>
             </w:r>
           </w:p>
         </w:tc>
@@ -13539,7 +13603,15 @@
           </w:tcPr>
           <w:p>
             <w:r>
-              <w:t xml:space="preserve">Lista (Auxiliar, Técnico, Supervisor, Jefe de </w:t>
+              <w:t xml:space="preserve">Lista (Auxiliar, Técnico, Supervisor, </w:t>
+            </w:r>
+            <w:proofErr w:type="gramStart"/>
+            <w:r>
+              <w:t>Jefe</w:t>
+            </w:r>
+            <w:proofErr w:type="gramEnd"/>
+            <w:r>
+              <w:t xml:space="preserve"> de </w:t>
             </w:r>
             <w:r>
               <w:lastRenderedPageBreak/>
@@ -14529,6 +14601,93 @@
           </w:tcPr>
           <w:p>
             <w:r>
+              <w:t>Número de teléfono</w:t>
+            </w:r>
+          </w:p>
+        </w:tc>
+        <w:tc>
+          <w:tcPr>
+            <w:tcW w:w="1700" w:type="dxa"/>
+            <w:tcMar>
+              <w:top w:w="40" w:type="dxa"/>
+              <w:left w:w="80" w:type="dxa"/>
+              <w:bottom w:w="40" w:type="dxa"/>
+              <w:right w:w="80" w:type="dxa"/>
+            </w:tcMar>
+            <w:vAlign w:val="center"/>
+          </w:tcPr>
+          <w:p>
+            <w:r>
+              <w:t>Texto</w:t>
+            </w:r>
+          </w:p>
+        </w:tc>
+        <w:tc>
+          <w:tcPr>
+            <w:tcW w:w="2600" w:type="dxa"/>
+            <w:tcMar>
+              <w:top w:w="40" w:type="dxa"/>
+              <w:left w:w="80" w:type="dxa"/>
+              <w:bottom w:w="40" w:type="dxa"/>
+              <w:right w:w="80" w:type="dxa"/>
+            </w:tcMar>
+            <w:vAlign w:val="center"/>
+          </w:tcPr>
+          <w:p>
+            <w:r>
+              <w:t>8 caracteres, sin extensión (+502)</w:t>
+            </w:r>
+          </w:p>
+        </w:tc>
+        <w:tc>
+          <w:tcPr>
+            <w:tcW w:w="1300" w:type="dxa"/>
+            <w:tcMar>
+              <w:top w:w="40" w:type="dxa"/>
+              <w:left w:w="80" w:type="dxa"/>
+              <w:bottom w:w="40" w:type="dxa"/>
+              <w:right w:w="80" w:type="dxa"/>
+            </w:tcMar>
+            <w:vAlign w:val="center"/>
+          </w:tcPr>
+          <w:p>
+            <w:r>
+              <w:t>Sí</w:t>
+            </w:r>
+          </w:p>
+        </w:tc>
+        <w:tc>
+          <w:tcPr>
+            <w:tcW w:w="1500" w:type="dxa"/>
+            <w:tcMar>
+              <w:top w:w="40" w:type="dxa"/>
+              <w:left w:w="80" w:type="dxa"/>
+              <w:bottom w:w="40" w:type="dxa"/>
+              <w:right w:w="80" w:type="dxa"/>
+            </w:tcMar>
+            <w:vAlign w:val="center"/>
+          </w:tcPr>
+          <w:p>
+            <w:r>
+              <w:t>Sí</w:t>
+            </w:r>
+          </w:p>
+        </w:tc>
+      </w:tr>
+      <w:tr>
+        <w:tc>
+          <w:tcPr>
+            <w:tcW w:w="1900" w:type="dxa"/>
+            <w:tcMar>
+              <w:top w:w="40" w:type="dxa"/>
+              <w:left w:w="80" w:type="dxa"/>
+              <w:bottom w:w="40" w:type="dxa"/>
+              <w:right w:w="80" w:type="dxa"/>
+            </w:tcMar>
+            <w:vAlign w:val="center"/>
+          </w:tcPr>
+          <w:p>
+            <w:r>
               <w:t>Contraseña Actual</w:t>
             </w:r>
           </w:p>
@@ -14563,7 +14722,10 @@
           </w:tcPr>
           <w:p>
             <w:r>
-              <w:t>Entre 8 y 20 caracteres</w:t>
+              <w:t>6</w:t>
+            </w:r>
+            <w:r>
+              <w:t xml:space="preserve"> caracteres</w:t>
             </w:r>
           </w:p>
         </w:tc>
@@ -15283,6 +15445,7 @@
               <w:rPr>
                 <w:b/>
               </w:rPr>
+              <w:lastRenderedPageBreak/>
               <w:t>MUNICIPALIDAD DE GRANADOS, B.V.</w:t>
             </w:r>
           </w:p>
@@ -15292,7 +15455,6 @@
               <w:jc w:val="center"/>
             </w:pPr>
             <w:r>
-              <w:lastRenderedPageBreak/>
               <w:t>Sistema de Quejas, Reclamos, Denuncias y Sugerencias</w:t>
             </w:r>
           </w:p>
@@ -15493,7 +15655,6 @@
               <w:rPr>
                 <w:b/>
               </w:rPr>
-              <w:lastRenderedPageBreak/>
               <w:t>Campo</w:t>
             </w:r>
           </w:p>
@@ -16067,6 +16228,7 @@
           <w:p>
             <w:proofErr w:type="spellStart"/>
             <w:r>
+              <w:lastRenderedPageBreak/>
               <w:t>numeroCaso</w:t>
             </w:r>
             <w:proofErr w:type="spellEnd"/>
@@ -16099,7 +16261,6 @@
           <w:p>
             <w:proofErr w:type="spellStart"/>
             <w:r>
-              <w:lastRenderedPageBreak/>
               <w:t>departamentoResponsable</w:t>
             </w:r>
             <w:proofErr w:type="spellEnd"/>
@@ -16927,6 +17088,7 @@
           <w:p>
             <w:proofErr w:type="spellStart"/>
             <w:r>
+              <w:lastRenderedPageBreak/>
               <w:t>nombreJefeDepartamento</w:t>
             </w:r>
             <w:proofErr w:type="spellEnd"/>
@@ -16951,7 +17113,6 @@
           <w:p>
             <w:proofErr w:type="spellStart"/>
             <w:r>
-              <w:lastRenderedPageBreak/>
               <w:t>fechaResolucion</w:t>
             </w:r>
             <w:proofErr w:type="spellEnd"/>
@@ -17011,7 +17172,15 @@
           </w:tcPr>
           <w:p>
             <w:r>
-              <w:t>Firma electrónica asociada al Jefe de Departamento (RN-CU17-02)</w:t>
+              <w:t xml:space="preserve">Firma electrónica asociada al </w:t>
+            </w:r>
+            <w:proofErr w:type="gramStart"/>
+            <w:r>
+              <w:t>Jefe</w:t>
+            </w:r>
+            <w:proofErr w:type="gramEnd"/>
+            <w:r>
+              <w:t xml:space="preserve"> de Departamento (RN-CU17-02)</w:t>
             </w:r>
           </w:p>
         </w:tc>

</xml_diff>